<commit_message>
perbaiki fitur draft generator
</commit_message>
<xml_diff>
--- a/SURAT SELESAI PERDA.docx
+++ b/SURAT SELESAI PERDA.docx
@@ -1,6 +1,6 @@
 
 <file path=word/document.xml><?xml version="1.0" encoding="utf-8"?>
-<w:document xmlns:wpc="http://schemas.microsoft.com/office/word/2010/wordprocessingCanvas" xmlns:mc="http://schemas.openxmlformats.org/markup-compatibility/2006" xmlns:o="urn:schemas-microsoft-com:office:office" xmlns:r="http://schemas.openxmlformats.org/officeDocument/2006/relationships" xmlns:m="http://schemas.openxmlformats.org/officeDocument/2006/math" xmlns:v="urn:schemas-microsoft-com:vml" xmlns:wp14="http://schemas.microsoft.com/office/word/2010/wordprocessingDrawing" xmlns:wp="http://schemas.openxmlformats.org/drawingml/2006/wordprocessingDrawing" xmlns:w10="urn:schemas-microsoft-com:office:word" xmlns:w="http://schemas.openxmlformats.org/wordprocessingml/2006/main" xmlns:w14="http://schemas.microsoft.com/office/word/2010/wordml" xmlns:w15="http://schemas.microsoft.com/office/word/2012/wordml" xmlns:wpg="http://schemas.microsoft.com/office/word/2010/wordprocessingGroup" xmlns:wpi="http://schemas.microsoft.com/office/word/2010/wordprocessingInk" xmlns:wne="http://schemas.microsoft.com/office/word/2006/wordml" xmlns:wps="http://schemas.microsoft.com/office/word/2010/wordprocessingShape" mc:Ignorable="w14 w15 wp14">
+<w:document xmlns:wpc="http://schemas.microsoft.com/office/word/2010/wordprocessingCanvas" xmlns:cx="http://schemas.microsoft.com/office/drawing/2014/chartex" xmlns:cx1="http://schemas.microsoft.com/office/drawing/2015/9/8/chartex" xmlns:cx2="http://schemas.microsoft.com/office/drawing/2015/10/21/chartex" xmlns:cx3="http://schemas.microsoft.com/office/drawing/2016/5/9/chartex" xmlns:cx4="http://schemas.microsoft.com/office/drawing/2016/5/10/chartex" xmlns:cx5="http://schemas.microsoft.com/office/drawing/2016/5/11/chartex" xmlns:cx6="http://schemas.microsoft.com/office/drawing/2016/5/12/chartex" xmlns:cx7="http://schemas.microsoft.com/office/drawing/2016/5/13/chartex" xmlns:cx8="http://schemas.microsoft.com/office/drawing/2016/5/14/chartex" xmlns:mc="http://schemas.openxmlformats.org/markup-compatibility/2006" xmlns:aink="http://schemas.microsoft.com/office/drawing/2016/ink" xmlns:am3d="http://schemas.microsoft.com/office/drawing/2017/model3d" xmlns:o="urn:schemas-microsoft-com:office:office" xmlns:oel="http://schemas.microsoft.com/office/2019/extlst" xmlns:r="http://schemas.openxmlformats.org/officeDocument/2006/relationships" xmlns:m="http://schemas.openxmlformats.org/officeDocument/2006/math" xmlns:v="urn:schemas-microsoft-com:vml" xmlns:wp14="http://schemas.microsoft.com/office/word/2010/wordprocessingDrawing" xmlns:wp="http://schemas.openxmlformats.org/drawingml/2006/wordprocessingDrawing" xmlns:w10="urn:schemas-microsoft-com:office:word" xmlns:w="http://schemas.openxmlformats.org/wordprocessingml/2006/main" xmlns:w14="http://schemas.microsoft.com/office/word/2010/wordml" xmlns:w15="http://schemas.microsoft.com/office/word/2012/wordml" xmlns:w16cex="http://schemas.microsoft.com/office/word/2018/wordml/cex" xmlns:w16cid="http://schemas.microsoft.com/office/word/2016/wordml/cid" xmlns:w16="http://schemas.microsoft.com/office/word/2018/wordml" xmlns:w16du="http://schemas.microsoft.com/office/word/2023/wordml/word16du" xmlns:w16sdtdh="http://schemas.microsoft.com/office/word/2020/wordml/sdtdatahash" xmlns:w16sdtfl="http://schemas.microsoft.com/office/word/2024/wordml/sdtformatlock" xmlns:w16se="http://schemas.microsoft.com/office/word/2015/wordml/symex" xmlns:wpg="http://schemas.microsoft.com/office/word/2010/wordprocessingGroup" xmlns:wpi="http://schemas.microsoft.com/office/word/2010/wordprocessingInk" xmlns:wne="http://schemas.microsoft.com/office/word/2006/wordml" xmlns:wps="http://schemas.microsoft.com/office/word/2010/wordprocessingShape" mc:Ignorable="w14 w15 w16se w16cid w16 w16cex w16sdtdh w16sdtfl w16du wp14">
   <w:body>
     <w:p>
       <w:pPr>
@@ -10,8 +10,6 @@
           <w:sz w:val="10"/>
         </w:rPr>
       </w:pPr>
-      <w:bookmarkStart w:id="0" w:name="_GoBack"/>
-      <w:bookmarkEnd w:id="0"/>
       <w:r>
         <w:rPr>
           <w:noProof/>
@@ -124,7 +122,7 @@
                 <v:stroke joinstyle="miter"/>
                 <v:path gradientshapeok="t" o:connecttype="rect"/>
               </v:shapetype>
-              <v:shape id="Text Box 5" o:spid="_x0000_s1026" type="#_x0000_t202" style="position:absolute;left:0;text-align:left;margin-left:0;margin-top:.9pt;width:475.5pt;height:78.75pt;z-index:-251657216;visibility:visible;mso-wrap-style:square;mso-width-percent:0;mso-height-percent:0;mso-wrap-distance-left:9pt;mso-wrap-distance-top:0;mso-wrap-distance-right:9pt;mso-wrap-distance-bottom:0;mso-position-horizontal:center;mso-position-horizontal-relative:page;mso-position-vertical:absolute;mso-position-vertical-relative:text;mso-width-percent:0;mso-height-percent:0;mso-width-relative:margin;mso-height-relative:margin;v-text-anchor:top" o:gfxdata="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" strokecolor="white">
+              <v:shape id="Text Box 5" o:spid="_x0000_s1026" type="#_x0000_t202" style="position:absolute;left:0;text-align:left;margin-left:0;margin-top:.9pt;width:475.5pt;height:78.75pt;z-index:-251657216;visibility:visible;mso-wrap-style:square;mso-width-percent:0;mso-height-percent:0;mso-wrap-distance-left:9pt;mso-wrap-distance-top:0;mso-wrap-distance-right:9pt;mso-wrap-distance-bottom:0;mso-position-horizontal:center;mso-position-horizontal-relative:page;mso-position-vertical:absolute;mso-position-vertical-relative:text;mso-width-percent:0;mso-height-percent:0;mso-width-relative:margin;mso-height-relative:margin;v-text-anchor:top" o:gfxdata="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" strokecolor="white">
                 <v:textbox>
                   <w:txbxContent>
                     <w:p>
@@ -225,7 +223,7 @@
           <w:lang w:val="en-US"/>
         </w:rPr>
         <w:drawing>
-          <wp:anchor distT="0" distB="0" distL="114300" distR="114300" simplePos="0" relativeHeight="251660288" behindDoc="0" locked="0" layoutInCell="1" allowOverlap="1" wp14:anchorId="43313FD5" wp14:editId="5184C45D">
+          <wp:anchor distT="0" distB="0" distL="114300" distR="114300" simplePos="0" relativeHeight="251660288" behindDoc="0" locked="0" layoutInCell="1" allowOverlap="1" wp14:anchorId="43313FD5" wp14:editId="3C65B98E">
             <wp:simplePos x="0" y="0"/>
             <wp:positionH relativeFrom="column">
               <wp:posOffset>38735</wp:posOffset>
@@ -601,43 +599,11 @@
             <w:r>
               <w:rPr>
                 <w:rFonts w:ascii="Arial" w:hAnsi="Arial" w:cs="Arial"/>
-                <w:color w:val="000000" w:themeColor="text1"/>
-                <w:lang w:val="en-US"/>
-              </w:rPr>
-              <w:fldChar w:fldCharType="begin"/>
-            </w:r>
-            <w:r>
-              <w:rPr>
-                <w:rFonts w:ascii="Arial" w:hAnsi="Arial" w:cs="Arial"/>
-                <w:color w:val="000000" w:themeColor="text1"/>
-                <w:lang w:val="en-US"/>
-              </w:rPr>
-              <w:instrText xml:space="preserve"> MERGEFIELD NOMOR_SURAT </w:instrText>
-            </w:r>
-            <w:r>
-              <w:rPr>
-                <w:rFonts w:ascii="Arial" w:hAnsi="Arial" w:cs="Arial"/>
-                <w:color w:val="000000" w:themeColor="text1"/>
-                <w:lang w:val="en-US"/>
-              </w:rPr>
-              <w:fldChar w:fldCharType="separate"/>
-            </w:r>
-            <w:r>
-              <w:rPr>
-                <w:rFonts w:ascii="Arial" w:hAnsi="Arial" w:cs="Arial"/>
                 <w:noProof/>
                 <w:color w:val="000000" w:themeColor="text1"/>
                 <w:lang w:val="en-US"/>
               </w:rPr>
-              <w:t>«NOMOR_SURAT»</w:t>
-            </w:r>
-            <w:r>
-              <w:rPr>
-                <w:rFonts w:ascii="Arial" w:hAnsi="Arial" w:cs="Arial"/>
-                <w:color w:val="000000" w:themeColor="text1"/>
-                <w:lang w:val="en-US"/>
-              </w:rPr>
-              <w:fldChar w:fldCharType="end"/>
+              <w:t>3375</w:t>
             </w:r>
             <w:r>
               <w:rPr>
@@ -670,43 +636,11 @@
             <w:r>
               <w:rPr>
                 <w:rFonts w:ascii="Arial" w:hAnsi="Arial" w:cs="Arial"/>
-                <w:color w:val="000000" w:themeColor="text1"/>
-                <w:lang w:val="en-US"/>
-              </w:rPr>
-              <w:fldChar w:fldCharType="begin"/>
-            </w:r>
-            <w:r>
-              <w:rPr>
-                <w:rFonts w:ascii="Arial" w:hAnsi="Arial" w:cs="Arial"/>
-                <w:color w:val="000000" w:themeColor="text1"/>
-                <w:lang w:val="en-US"/>
-              </w:rPr>
-              <w:instrText xml:space="preserve"> MERGEFIELD TANGGAL_SURAT </w:instrText>
-            </w:r>
-            <w:r>
-              <w:rPr>
-                <w:rFonts w:ascii="Arial" w:hAnsi="Arial" w:cs="Arial"/>
-                <w:color w:val="000000" w:themeColor="text1"/>
-                <w:lang w:val="en-US"/>
-              </w:rPr>
-              <w:fldChar w:fldCharType="separate"/>
-            </w:r>
-            <w:r>
-              <w:rPr>
-                <w:rFonts w:ascii="Arial" w:hAnsi="Arial" w:cs="Arial"/>
                 <w:noProof/>
                 <w:color w:val="000000" w:themeColor="text1"/>
                 <w:lang w:val="en-US"/>
               </w:rPr>
               <w:t>«TANGGAL_SURAT»</w:t>
-            </w:r>
-            <w:r>
-              <w:rPr>
-                <w:rFonts w:ascii="Arial" w:hAnsi="Arial" w:cs="Arial"/>
-                <w:color w:val="000000" w:themeColor="text1"/>
-                <w:lang w:val="en-US"/>
-              </w:rPr>
-              <w:fldChar w:fldCharType="end"/>
             </w:r>
           </w:p>
         </w:tc>
@@ -882,6 +816,7 @@
               </w:tabs>
               <w:spacing w:before="22"/>
               <w:ind w:right="-39"/>
+              <w:jc w:val="both"/>
               <w:rPr>
                 <w:rFonts w:ascii="Arial" w:hAnsi="Arial" w:cs="Arial"/>
                 <w:color w:val="000000" w:themeColor="text1"/>
@@ -890,38 +825,10 @@
             <w:r>
               <w:rPr>
                 <w:rFonts w:ascii="Arial" w:hAnsi="Arial" w:cs="Arial"/>
-                <w:color w:val="000000" w:themeColor="text1"/>
-              </w:rPr>
-              <w:fldChar w:fldCharType="begin"/>
-            </w:r>
-            <w:r>
-              <w:rPr>
-                <w:rFonts w:ascii="Arial" w:hAnsi="Arial" w:cs="Arial"/>
-                <w:color w:val="000000" w:themeColor="text1"/>
-              </w:rPr>
-              <w:instrText xml:space="preserve"> MERGEFIELD HAL </w:instrText>
-            </w:r>
-            <w:r>
-              <w:rPr>
-                <w:rFonts w:ascii="Arial" w:hAnsi="Arial" w:cs="Arial"/>
-                <w:color w:val="000000" w:themeColor="text1"/>
-              </w:rPr>
-              <w:fldChar w:fldCharType="separate"/>
-            </w:r>
-            <w:r>
-              <w:rPr>
-                <w:rFonts w:ascii="Arial" w:hAnsi="Arial" w:cs="Arial"/>
                 <w:noProof/>
                 <w:color w:val="000000" w:themeColor="text1"/>
               </w:rPr>
               <w:t>«HAL»</w:t>
-            </w:r>
-            <w:r>
-              <w:rPr>
-                <w:rFonts w:ascii="Arial" w:hAnsi="Arial" w:cs="Arial"/>
-                <w:color w:val="000000" w:themeColor="text1"/>
-              </w:rPr>
-              <w:fldChar w:fldCharType="end"/>
             </w:r>
           </w:p>
         </w:tc>
@@ -1028,38 +935,10 @@
             <w:r>
               <w:rPr>
                 <w:rFonts w:ascii="Arial" w:hAnsi="Arial" w:cs="Arial"/>
-                <w:color w:val="000000" w:themeColor="text1"/>
-              </w:rPr>
-              <w:fldChar w:fldCharType="begin"/>
-            </w:r>
-            <w:r>
-              <w:rPr>
-                <w:rFonts w:ascii="Arial" w:hAnsi="Arial" w:cs="Arial"/>
-                <w:color w:val="000000" w:themeColor="text1"/>
-              </w:rPr>
-              <w:instrText xml:space="preserve"> MERGEFIELD JABATAN_PEMRAKARSA </w:instrText>
-            </w:r>
-            <w:r>
-              <w:rPr>
-                <w:rFonts w:ascii="Arial" w:hAnsi="Arial" w:cs="Arial"/>
-                <w:color w:val="000000" w:themeColor="text1"/>
-              </w:rPr>
-              <w:fldChar w:fldCharType="separate"/>
-            </w:r>
-            <w:r>
-              <w:rPr>
-                <w:rFonts w:ascii="Arial" w:hAnsi="Arial" w:cs="Arial"/>
                 <w:noProof/>
                 <w:color w:val="000000" w:themeColor="text1"/>
               </w:rPr>
               <w:t>«JABATAN_PEMRAKARSA»</w:t>
-            </w:r>
-            <w:r>
-              <w:rPr>
-                <w:rFonts w:ascii="Arial" w:hAnsi="Arial" w:cs="Arial"/>
-                <w:color w:val="000000" w:themeColor="text1"/>
-              </w:rPr>
-              <w:fldChar w:fldCharType="end"/>
             </w:r>
           </w:p>
         </w:tc>
@@ -1136,38 +1015,10 @@
             <w:r>
               <w:rPr>
                 <w:rFonts w:ascii="Arial" w:hAnsi="Arial" w:cs="Arial"/>
-                <w:color w:val="000000" w:themeColor="text1"/>
-              </w:rPr>
-              <w:fldChar w:fldCharType="begin"/>
-            </w:r>
-            <w:r>
-              <w:rPr>
-                <w:rFonts w:ascii="Arial" w:hAnsi="Arial" w:cs="Arial"/>
-                <w:color w:val="000000" w:themeColor="text1"/>
-              </w:rPr>
-              <w:instrText xml:space="preserve"> MERGEFIELD IBUKOTA </w:instrText>
-            </w:r>
-            <w:r>
-              <w:rPr>
-                <w:rFonts w:ascii="Arial" w:hAnsi="Arial" w:cs="Arial"/>
-                <w:color w:val="000000" w:themeColor="text1"/>
-              </w:rPr>
-              <w:fldChar w:fldCharType="separate"/>
-            </w:r>
-            <w:r>
-              <w:rPr>
-                <w:rFonts w:ascii="Arial" w:hAnsi="Arial" w:cs="Arial"/>
                 <w:noProof/>
                 <w:color w:val="000000" w:themeColor="text1"/>
               </w:rPr>
               <w:t>«IBUKOTA»</w:t>
-            </w:r>
-            <w:r>
-              <w:rPr>
-                <w:rFonts w:ascii="Arial" w:hAnsi="Arial" w:cs="Arial"/>
-                <w:color w:val="000000" w:themeColor="text1"/>
-              </w:rPr>
-              <w:fldChar w:fldCharType="end"/>
             </w:r>
           </w:p>
         </w:tc>
@@ -1226,27 +1077,6 @@
       <w:r>
         <w:rPr>
           <w:rFonts w:ascii="Arial" w:hAnsi="Arial" w:cs="Arial"/>
-          <w:color w:val="000000" w:themeColor="text1"/>
-        </w:rPr>
-        <w:fldChar w:fldCharType="begin"/>
-      </w:r>
-      <w:r>
-        <w:rPr>
-          <w:rFonts w:ascii="Arial" w:hAnsi="Arial" w:cs="Arial"/>
-          <w:color w:val="000000" w:themeColor="text1"/>
-        </w:rPr>
-        <w:instrText xml:space="preserve"> MERGEFIELD JABATAN_PEMRAKARSA </w:instrText>
-      </w:r>
-      <w:r>
-        <w:rPr>
-          <w:rFonts w:ascii="Arial" w:hAnsi="Arial" w:cs="Arial"/>
-          <w:color w:val="000000" w:themeColor="text1"/>
-        </w:rPr>
-        <w:fldChar w:fldCharType="separate"/>
-      </w:r>
-      <w:r>
-        <w:rPr>
-          <w:rFonts w:ascii="Arial" w:hAnsi="Arial" w:cs="Arial"/>
           <w:noProof/>
           <w:color w:val="000000" w:themeColor="text1"/>
         </w:rPr>
@@ -1257,13 +1087,6 @@
           <w:rFonts w:ascii="Arial" w:hAnsi="Arial" w:cs="Arial"/>
           <w:color w:val="000000" w:themeColor="text1"/>
         </w:rPr>
-        <w:fldChar w:fldCharType="end"/>
-      </w:r>
-      <w:r>
-        <w:rPr>
-          <w:rFonts w:ascii="Arial" w:hAnsi="Arial" w:cs="Arial"/>
-          <w:color w:val="000000" w:themeColor="text1"/>
-        </w:rPr>
         <w:t xml:space="preserve"> </w:t>
       </w:r>
       <w:r>
@@ -1275,24 +1098,12 @@
         <w:t xml:space="preserve">Nomor </w:t>
       </w:r>
       <w:r>
-        <w:fldChar w:fldCharType="begin"/>
-      </w:r>
-      <w:r>
-        <w:instrText xml:space="preserve"> MERGEFIELD NOMOR_SURAT_P </w:instrText>
-      </w:r>
-      <w:r>
-        <w:fldChar w:fldCharType="separate"/>
-      </w:r>
-      <w:r>
         <w:rPr>
           <w:noProof/>
         </w:rPr>
         <w:t>«NOMOR_SURAT_P»</w:t>
       </w:r>
       <w:r>
-        <w:fldChar w:fldCharType="end"/>
-      </w:r>
-      <w:r>
         <w:t xml:space="preserve"> </w:t>
       </w:r>
       <w:proofErr w:type="spellStart"/>
@@ -1310,27 +1121,6 @@
           <w:lang w:val="en-US"/>
         </w:rPr>
         <w:t xml:space="preserve"> </w:t>
-      </w:r>
-      <w:r>
-        <w:rPr>
-          <w:rFonts w:ascii="Arial" w:hAnsi="Arial" w:cs="Arial"/>
-          <w:lang w:val="en-US"/>
-        </w:rPr>
-        <w:fldChar w:fldCharType="begin"/>
-      </w:r>
-      <w:r>
-        <w:rPr>
-          <w:rFonts w:ascii="Arial" w:hAnsi="Arial" w:cs="Arial"/>
-          <w:lang w:val="en-US"/>
-        </w:rPr>
-        <w:instrText xml:space="preserve"> MERGEFIELD TANGGAL_SURAT_P </w:instrText>
-      </w:r>
-      <w:r>
-        <w:rPr>
-          <w:rFonts w:ascii="Arial" w:hAnsi="Arial" w:cs="Arial"/>
-          <w:lang w:val="en-US"/>
-        </w:rPr>
-        <w:fldChar w:fldCharType="separate"/>
       </w:r>
       <w:r>
         <w:rPr>
@@ -1343,37 +1133,9 @@
       <w:r>
         <w:rPr>
           <w:rFonts w:ascii="Arial" w:hAnsi="Arial" w:cs="Arial"/>
-          <w:lang w:val="en-US"/>
-        </w:rPr>
-        <w:fldChar w:fldCharType="end"/>
-      </w:r>
-      <w:r>
-        <w:rPr>
-          <w:rFonts w:ascii="Arial" w:hAnsi="Arial" w:cs="Arial"/>
           <w:color w:val="000000" w:themeColor="text1"/>
         </w:rPr>
         <w:t xml:space="preserve"> perihal Mohon Harmonisasi Rancangan </w:t>
-      </w:r>
-      <w:r>
-        <w:rPr>
-          <w:rFonts w:ascii="Arial" w:hAnsi="Arial" w:cs="Arial"/>
-          <w:color w:val="000000" w:themeColor="text1"/>
-        </w:rPr>
-        <w:fldChar w:fldCharType="begin"/>
-      </w:r>
-      <w:r>
-        <w:rPr>
-          <w:rFonts w:ascii="Arial" w:hAnsi="Arial" w:cs="Arial"/>
-          <w:color w:val="000000" w:themeColor="text1"/>
-        </w:rPr>
-        <w:instrText xml:space="preserve"> MERGEFIELD JENIS_PERATURAN </w:instrText>
-      </w:r>
-      <w:r>
-        <w:rPr>
-          <w:rFonts w:ascii="Arial" w:hAnsi="Arial" w:cs="Arial"/>
-          <w:color w:val="000000" w:themeColor="text1"/>
-        </w:rPr>
-        <w:fldChar w:fldCharType="separate"/>
       </w:r>
       <w:r>
         <w:rPr>
@@ -1388,35 +1150,7 @@
           <w:rFonts w:ascii="Arial" w:hAnsi="Arial" w:cs="Arial"/>
           <w:color w:val="000000" w:themeColor="text1"/>
         </w:rPr>
-        <w:fldChar w:fldCharType="end"/>
-      </w:r>
-      <w:r>
-        <w:rPr>
-          <w:rFonts w:ascii="Arial" w:hAnsi="Arial" w:cs="Arial"/>
-          <w:color w:val="000000" w:themeColor="text1"/>
-        </w:rPr>
         <w:t xml:space="preserve"> </w:t>
-      </w:r>
-      <w:r>
-        <w:rPr>
-          <w:rFonts w:ascii="Arial" w:hAnsi="Arial" w:cs="Arial"/>
-          <w:color w:val="000000" w:themeColor="text1"/>
-        </w:rPr>
-        <w:fldChar w:fldCharType="begin"/>
-      </w:r>
-      <w:r>
-        <w:rPr>
-          <w:rFonts w:ascii="Arial" w:hAnsi="Arial" w:cs="Arial"/>
-          <w:color w:val="000000" w:themeColor="text1"/>
-        </w:rPr>
-        <w:instrText xml:space="preserve"> MERGEFIELD ASAL_PEMRAKARSA </w:instrText>
-      </w:r>
-      <w:r>
-        <w:rPr>
-          <w:rFonts w:ascii="Arial" w:hAnsi="Arial" w:cs="Arial"/>
-          <w:color w:val="000000" w:themeColor="text1"/>
-        </w:rPr>
-        <w:fldChar w:fldCharType="separate"/>
       </w:r>
       <w:r>
         <w:rPr>
@@ -1431,35 +1165,7 @@
           <w:rFonts w:ascii="Arial" w:hAnsi="Arial" w:cs="Arial"/>
           <w:color w:val="000000" w:themeColor="text1"/>
         </w:rPr>
-        <w:fldChar w:fldCharType="end"/>
-      </w:r>
-      <w:r>
-        <w:rPr>
-          <w:rFonts w:ascii="Arial" w:hAnsi="Arial" w:cs="Arial"/>
-          <w:color w:val="000000" w:themeColor="text1"/>
-        </w:rPr>
         <w:t xml:space="preserve">, berikut ini kami sampaikan bahwa Rancangan </w:t>
-      </w:r>
-      <w:r>
-        <w:rPr>
-          <w:rFonts w:ascii="Arial" w:hAnsi="Arial" w:cs="Arial"/>
-          <w:color w:val="000000" w:themeColor="text1"/>
-        </w:rPr>
-        <w:fldChar w:fldCharType="begin"/>
-      </w:r>
-      <w:r>
-        <w:rPr>
-          <w:rFonts w:ascii="Arial" w:hAnsi="Arial" w:cs="Arial"/>
-          <w:color w:val="000000" w:themeColor="text1"/>
-        </w:rPr>
-        <w:instrText xml:space="preserve"> MERGEFIELD JENIS_PERATURAN </w:instrText>
-      </w:r>
-      <w:r>
-        <w:rPr>
-          <w:rFonts w:ascii="Arial" w:hAnsi="Arial" w:cs="Arial"/>
-          <w:color w:val="000000" w:themeColor="text1"/>
-        </w:rPr>
-        <w:fldChar w:fldCharType="separate"/>
       </w:r>
       <w:r>
         <w:rPr>
@@ -1474,7 +1180,7 @@
           <w:rFonts w:ascii="Arial" w:hAnsi="Arial" w:cs="Arial"/>
           <w:color w:val="000000" w:themeColor="text1"/>
         </w:rPr>
-        <w:fldChar w:fldCharType="end"/>
+        <w:t xml:space="preserve"> </w:t>
       </w:r>
       <w:r>
         <w:rPr>
@@ -1482,34 +1188,6 @@
           <w:color w:val="000000" w:themeColor="text1"/>
         </w:rPr>
         <w:t xml:space="preserve"> </w:t>
-      </w:r>
-      <w:r>
-        <w:rPr>
-          <w:rFonts w:ascii="Arial" w:hAnsi="Arial" w:cs="Arial"/>
-          <w:color w:val="000000" w:themeColor="text1"/>
-        </w:rPr>
-        <w:t xml:space="preserve"> </w:t>
-      </w:r>
-      <w:r>
-        <w:rPr>
-          <w:rFonts w:ascii="Arial" w:hAnsi="Arial" w:cs="Arial"/>
-          <w:color w:val="000000" w:themeColor="text1"/>
-        </w:rPr>
-        <w:fldChar w:fldCharType="begin"/>
-      </w:r>
-      <w:r>
-        <w:rPr>
-          <w:rFonts w:ascii="Arial" w:hAnsi="Arial" w:cs="Arial"/>
-          <w:color w:val="000000" w:themeColor="text1"/>
-        </w:rPr>
-        <w:instrText xml:space="preserve"> MERGEFIELD ASAL_PEMRAKARSA </w:instrText>
-      </w:r>
-      <w:r>
-        <w:rPr>
-          <w:rFonts w:ascii="Arial" w:hAnsi="Arial" w:cs="Arial"/>
-          <w:color w:val="000000" w:themeColor="text1"/>
-        </w:rPr>
-        <w:fldChar w:fldCharType="separate"/>
       </w:r>
       <w:r>
         <w:rPr>
@@ -1524,42 +1202,14 @@
           <w:rFonts w:ascii="Arial" w:hAnsi="Arial" w:cs="Arial"/>
           <w:color w:val="000000" w:themeColor="text1"/>
         </w:rPr>
-        <w:fldChar w:fldCharType="end"/>
+        <w:t xml:space="preserve"> </w:t>
       </w:r>
       <w:r>
         <w:rPr>
           <w:rFonts w:ascii="Arial" w:hAnsi="Arial" w:cs="Arial"/>
           <w:color w:val="000000" w:themeColor="text1"/>
         </w:rPr>
-        <w:t xml:space="preserve"> </w:t>
-      </w:r>
-      <w:r>
-        <w:rPr>
-          <w:rFonts w:ascii="Arial" w:hAnsi="Arial" w:cs="Arial"/>
-          <w:color w:val="000000" w:themeColor="text1"/>
-        </w:rPr>
         <w:t xml:space="preserve">tentang </w:t>
-      </w:r>
-      <w:r>
-        <w:rPr>
-          <w:rFonts w:ascii="Arial" w:hAnsi="Arial" w:cs="Arial"/>
-          <w:color w:val="000000" w:themeColor="text1"/>
-        </w:rPr>
-        <w:fldChar w:fldCharType="begin"/>
-      </w:r>
-      <w:r>
-        <w:rPr>
-          <w:rFonts w:ascii="Arial" w:hAnsi="Arial" w:cs="Arial"/>
-          <w:color w:val="000000" w:themeColor="text1"/>
-        </w:rPr>
-        <w:instrText xml:space="preserve"> MERGEFIELD JUDUL_PERATURAN </w:instrText>
-      </w:r>
-      <w:r>
-        <w:rPr>
-          <w:rFonts w:ascii="Arial" w:hAnsi="Arial" w:cs="Arial"/>
-          <w:color w:val="000000" w:themeColor="text1"/>
-        </w:rPr>
-        <w:fldChar w:fldCharType="separate"/>
       </w:r>
       <w:r>
         <w:rPr>
@@ -1574,13 +1224,6 @@
           <w:rFonts w:ascii="Arial" w:hAnsi="Arial" w:cs="Arial"/>
           <w:color w:val="000000" w:themeColor="text1"/>
         </w:rPr>
-        <w:fldChar w:fldCharType="end"/>
-      </w:r>
-      <w:r>
-        <w:rPr>
-          <w:rFonts w:ascii="Arial" w:hAnsi="Arial" w:cs="Arial"/>
-          <w:color w:val="000000" w:themeColor="text1"/>
-        </w:rPr>
         <w:t xml:space="preserve"> </w:t>
       </w:r>
       <w:r>
@@ -1611,30 +1254,6 @@
           <w:lang w:val="id-ID"/>
         </w:rPr>
         <w:t xml:space="preserve">dengan hasil Rancangan </w:t>
-      </w:r>
-      <w:r>
-        <w:rPr>
-          <w:rFonts w:ascii="Arial" w:hAnsi="Arial" w:cs="Arial"/>
-          <w:color w:val="000000" w:themeColor="text1"/>
-          <w:lang w:val="id-ID"/>
-        </w:rPr>
-        <w:fldChar w:fldCharType="begin"/>
-      </w:r>
-      <w:r>
-        <w:rPr>
-          <w:rFonts w:ascii="Arial" w:hAnsi="Arial" w:cs="Arial"/>
-          <w:color w:val="000000" w:themeColor="text1"/>
-          <w:lang w:val="id-ID"/>
-        </w:rPr>
-        <w:instrText xml:space="preserve"> MERGEFIELD JENIS_PERATURAN </w:instrText>
-      </w:r>
-      <w:r>
-        <w:rPr>
-          <w:rFonts w:ascii="Arial" w:hAnsi="Arial" w:cs="Arial"/>
-          <w:color w:val="000000" w:themeColor="text1"/>
-          <w:lang w:val="id-ID"/>
-        </w:rPr>
-        <w:fldChar w:fldCharType="separate"/>
       </w:r>
       <w:r>
         <w:rPr>
@@ -1644,14 +1263,6 @@
           <w:lang w:val="id-ID"/>
         </w:rPr>
         <w:t>«JENIS_PERATURAN»</w:t>
-      </w:r>
-      <w:r>
-        <w:rPr>
-          <w:rFonts w:ascii="Arial" w:hAnsi="Arial" w:cs="Arial"/>
-          <w:color w:val="000000" w:themeColor="text1"/>
-          <w:lang w:val="id-ID"/>
-        </w:rPr>
-        <w:fldChar w:fldCharType="end"/>
       </w:r>
       <w:r>
         <w:rPr>
@@ -1762,7 +1373,7 @@
         <w:rPr>
           <w:rFonts w:ascii="Arial" w:hAnsi="Arial" w:cs="Arial"/>
         </w:rPr>
-        <w:t xml:space="preserve">Kepala Kantor Wilayah </w:t>
+        <w:t xml:space="preserve">«JABATAN_KAKANWIL» </w:t>
       </w:r>
     </w:p>
     <w:p>
@@ -1810,7 +1421,7 @@
         <w:rPr>
           <w:rFonts w:ascii="Arial" w:hAnsi="Arial" w:cs="Arial"/>
         </w:rPr>
-        <w:t>Rudy Hendra Pakpahan</w:t>
+        <w:t>«NAMA_KAKANWIL»</w:t>
       </w:r>
     </w:p>
     <w:p>
@@ -2064,8 +1675,8 @@
 </file>
 
 <file path=word/numbering.xml><?xml version="1.0" encoding="utf-8"?>
-<w:numbering xmlns:wpc="http://schemas.microsoft.com/office/word/2010/wordprocessingCanvas" xmlns:mc="http://schemas.openxmlformats.org/markup-compatibility/2006" xmlns:o="urn:schemas-microsoft-com:office:office" xmlns:r="http://schemas.openxmlformats.org/officeDocument/2006/relationships" xmlns:m="http://schemas.openxmlformats.org/officeDocument/2006/math" xmlns:v="urn:schemas-microsoft-com:vml" xmlns:wp14="http://schemas.microsoft.com/office/word/2010/wordprocessingDrawing" xmlns:wp="http://schemas.openxmlformats.org/drawingml/2006/wordprocessingDrawing" xmlns:w10="urn:schemas-microsoft-com:office:word" xmlns:w="http://schemas.openxmlformats.org/wordprocessingml/2006/main" xmlns:w14="http://schemas.microsoft.com/office/word/2010/wordml" xmlns:w15="http://schemas.microsoft.com/office/word/2012/wordml" xmlns:wpg="http://schemas.microsoft.com/office/word/2010/wordprocessingGroup" xmlns:wpi="http://schemas.microsoft.com/office/word/2010/wordprocessingInk" xmlns:wne="http://schemas.microsoft.com/office/word/2006/wordml" xmlns:wps="http://schemas.microsoft.com/office/word/2010/wordprocessingShape" mc:Ignorable="w14 w15 wp14">
-  <w:abstractNum w:abstractNumId="0">
+<w:numbering xmlns:wpc="http://schemas.microsoft.com/office/word/2010/wordprocessingCanvas" xmlns:cx="http://schemas.microsoft.com/office/drawing/2014/chartex" xmlns:cx1="http://schemas.microsoft.com/office/drawing/2015/9/8/chartex" xmlns:cx2="http://schemas.microsoft.com/office/drawing/2015/10/21/chartex" xmlns:cx3="http://schemas.microsoft.com/office/drawing/2016/5/9/chartex" xmlns:cx4="http://schemas.microsoft.com/office/drawing/2016/5/10/chartex" xmlns:cx5="http://schemas.microsoft.com/office/drawing/2016/5/11/chartex" xmlns:cx6="http://schemas.microsoft.com/office/drawing/2016/5/12/chartex" xmlns:cx7="http://schemas.microsoft.com/office/drawing/2016/5/13/chartex" xmlns:cx8="http://schemas.microsoft.com/office/drawing/2016/5/14/chartex" xmlns:mc="http://schemas.openxmlformats.org/markup-compatibility/2006" xmlns:aink="http://schemas.microsoft.com/office/drawing/2016/ink" xmlns:am3d="http://schemas.microsoft.com/office/drawing/2017/model3d" xmlns:o="urn:schemas-microsoft-com:office:office" xmlns:oel="http://schemas.microsoft.com/office/2019/extlst" xmlns:r="http://schemas.openxmlformats.org/officeDocument/2006/relationships" xmlns:m="http://schemas.openxmlformats.org/officeDocument/2006/math" xmlns:v="urn:schemas-microsoft-com:vml" xmlns:wp14="http://schemas.microsoft.com/office/word/2010/wordprocessingDrawing" xmlns:wp="http://schemas.openxmlformats.org/drawingml/2006/wordprocessingDrawing" xmlns:w10="urn:schemas-microsoft-com:office:word" xmlns:w="http://schemas.openxmlformats.org/wordprocessingml/2006/main" xmlns:w14="http://schemas.microsoft.com/office/word/2010/wordml" xmlns:w15="http://schemas.microsoft.com/office/word/2012/wordml" xmlns:w16cex="http://schemas.microsoft.com/office/word/2018/wordml/cex" xmlns:w16cid="http://schemas.microsoft.com/office/word/2016/wordml/cid" xmlns:w16="http://schemas.microsoft.com/office/word/2018/wordml" xmlns:w16du="http://schemas.microsoft.com/office/word/2023/wordml/word16du" xmlns:w16sdtdh="http://schemas.microsoft.com/office/word/2020/wordml/sdtdatahash" xmlns:w16sdtfl="http://schemas.microsoft.com/office/word/2024/wordml/sdtformatlock" xmlns:w16se="http://schemas.microsoft.com/office/word/2015/wordml/symex" xmlns:wpg="http://schemas.microsoft.com/office/word/2010/wordprocessingGroup" xmlns:wpi="http://schemas.microsoft.com/office/word/2010/wordprocessingInk" xmlns:wne="http://schemas.microsoft.com/office/word/2006/wordml" xmlns:wps="http://schemas.microsoft.com/office/word/2010/wordprocessingShape" mc:Ignorable="w14 w15 w16se w16cid w16 w16cex w16sdtdh w16sdtfl w16du wp14">
+  <w:abstractNum w:abstractNumId="0" w15:restartNumberingAfterBreak="0">
     <w:nsid w:val="01926445"/>
     <w:multiLevelType w:val="hybridMultilevel"/>
     <w:tmpl w:val="DB76E97C"/>
@@ -2178,7 +1789,7 @@
       </w:rPr>
     </w:lvl>
   </w:abstractNum>
-  <w:abstractNum w:abstractNumId="1">
+  <w:abstractNum w:abstractNumId="1" w15:restartNumberingAfterBreak="0">
     <w:nsid w:val="05011693"/>
     <w:multiLevelType w:val="hybridMultilevel"/>
     <w:tmpl w:val="9A94888A"/>
@@ -2296,7 +1907,7 @@
       </w:rPr>
     </w:lvl>
   </w:abstractNum>
-  <w:abstractNum w:abstractNumId="2">
+  <w:abstractNum w:abstractNumId="2" w15:restartNumberingAfterBreak="0">
     <w:nsid w:val="08111E5E"/>
     <w:multiLevelType w:val="hybridMultilevel"/>
     <w:tmpl w:val="F67ED8D0"/>
@@ -2385,7 +1996,7 @@
       </w:pPr>
     </w:lvl>
   </w:abstractNum>
-  <w:abstractNum w:abstractNumId="3">
+  <w:abstractNum w:abstractNumId="3" w15:restartNumberingAfterBreak="0">
     <w:nsid w:val="140B2B80"/>
     <w:multiLevelType w:val="hybridMultilevel"/>
     <w:tmpl w:val="D50CD3EA"/>
@@ -2474,7 +2085,7 @@
       </w:pPr>
     </w:lvl>
   </w:abstractNum>
-  <w:abstractNum w:abstractNumId="4">
+  <w:abstractNum w:abstractNumId="4" w15:restartNumberingAfterBreak="0">
     <w:nsid w:val="269F52C0"/>
     <w:multiLevelType w:val="hybridMultilevel"/>
     <w:tmpl w:val="9A8A22BE"/>
@@ -2563,7 +2174,7 @@
       </w:pPr>
     </w:lvl>
   </w:abstractNum>
-  <w:abstractNum w:abstractNumId="5">
+  <w:abstractNum w:abstractNumId="5" w15:restartNumberingAfterBreak="0">
     <w:nsid w:val="2F050147"/>
     <w:multiLevelType w:val="hybridMultilevel"/>
     <w:tmpl w:val="50A42C96"/>
@@ -2676,7 +2287,7 @@
       </w:rPr>
     </w:lvl>
   </w:abstractNum>
-  <w:abstractNum w:abstractNumId="6">
+  <w:abstractNum w:abstractNumId="6" w15:restartNumberingAfterBreak="0">
     <w:nsid w:val="2F6F62E3"/>
     <w:multiLevelType w:val="hybridMultilevel"/>
     <w:tmpl w:val="F0EE69D8"/>
@@ -2765,7 +2376,7 @@
       </w:pPr>
     </w:lvl>
   </w:abstractNum>
-  <w:abstractNum w:abstractNumId="7">
+  <w:abstractNum w:abstractNumId="7" w15:restartNumberingAfterBreak="0">
     <w:nsid w:val="3A103D22"/>
     <w:multiLevelType w:val="hybridMultilevel"/>
     <w:tmpl w:val="08B67CC4"/>
@@ -2883,7 +2494,7 @@
       </w:rPr>
     </w:lvl>
   </w:abstractNum>
-  <w:abstractNum w:abstractNumId="8">
+  <w:abstractNum w:abstractNumId="8" w15:restartNumberingAfterBreak="0">
     <w:nsid w:val="403C0490"/>
     <w:multiLevelType w:val="hybridMultilevel"/>
     <w:tmpl w:val="8100517E"/>
@@ -3001,7 +2612,7 @@
       </w:rPr>
     </w:lvl>
   </w:abstractNum>
-  <w:abstractNum w:abstractNumId="9">
+  <w:abstractNum w:abstractNumId="9" w15:restartNumberingAfterBreak="0">
     <w:nsid w:val="46851152"/>
     <w:multiLevelType w:val="hybridMultilevel"/>
     <w:tmpl w:val="7E9452C4"/>
@@ -3090,7 +2701,7 @@
       </w:pPr>
     </w:lvl>
   </w:abstractNum>
-  <w:abstractNum w:abstractNumId="10">
+  <w:abstractNum w:abstractNumId="10" w15:restartNumberingAfterBreak="0">
     <w:nsid w:val="47B076C8"/>
     <w:multiLevelType w:val="hybridMultilevel"/>
     <w:tmpl w:val="8100517E"/>
@@ -3208,7 +2819,7 @@
       </w:rPr>
     </w:lvl>
   </w:abstractNum>
-  <w:abstractNum w:abstractNumId="11">
+  <w:abstractNum w:abstractNumId="11" w15:restartNumberingAfterBreak="0">
     <w:nsid w:val="484B2E6C"/>
     <w:multiLevelType w:val="hybridMultilevel"/>
     <w:tmpl w:val="7932CF5A"/>
@@ -3297,7 +2908,7 @@
       </w:pPr>
     </w:lvl>
   </w:abstractNum>
-  <w:abstractNum w:abstractNumId="12">
+  <w:abstractNum w:abstractNumId="12" w15:restartNumberingAfterBreak="0">
     <w:nsid w:val="502433FC"/>
     <w:multiLevelType w:val="hybridMultilevel"/>
     <w:tmpl w:val="1272203C"/>
@@ -3414,7 +3025,7 @@
       </w:rPr>
     </w:lvl>
   </w:abstractNum>
-  <w:abstractNum w:abstractNumId="13">
+  <w:abstractNum w:abstractNumId="13" w15:restartNumberingAfterBreak="0">
     <w:nsid w:val="576E6C18"/>
     <w:multiLevelType w:val="hybridMultilevel"/>
     <w:tmpl w:val="EAA2F3D8"/>
@@ -3503,7 +3114,7 @@
       </w:pPr>
     </w:lvl>
   </w:abstractNum>
-  <w:abstractNum w:abstractNumId="14">
+  <w:abstractNum w:abstractNumId="14" w15:restartNumberingAfterBreak="0">
     <w:nsid w:val="5C9169B8"/>
     <w:multiLevelType w:val="hybridMultilevel"/>
     <w:tmpl w:val="EC74E69E"/>
@@ -3589,7 +3200,7 @@
       </w:pPr>
     </w:lvl>
   </w:abstractNum>
-  <w:abstractNum w:abstractNumId="15">
+  <w:abstractNum w:abstractNumId="15" w15:restartNumberingAfterBreak="0">
     <w:nsid w:val="60014368"/>
     <w:multiLevelType w:val="hybridMultilevel"/>
     <w:tmpl w:val="AB2C5AA4"/>
@@ -3678,7 +3289,7 @@
       </w:pPr>
     </w:lvl>
   </w:abstractNum>
-  <w:abstractNum w:abstractNumId="16">
+  <w:abstractNum w:abstractNumId="16" w15:restartNumberingAfterBreak="0">
     <w:nsid w:val="60E87280"/>
     <w:multiLevelType w:val="hybridMultilevel"/>
     <w:tmpl w:val="E4426990"/>
@@ -3764,7 +3375,7 @@
       </w:pPr>
     </w:lvl>
   </w:abstractNum>
-  <w:abstractNum w:abstractNumId="17">
+  <w:abstractNum w:abstractNumId="17" w15:restartNumberingAfterBreak="0">
     <w:nsid w:val="616F277A"/>
     <w:multiLevelType w:val="hybridMultilevel"/>
     <w:tmpl w:val="5D1674DA"/>
@@ -3853,7 +3464,7 @@
       </w:pPr>
     </w:lvl>
   </w:abstractNum>
-  <w:abstractNum w:abstractNumId="18">
+  <w:abstractNum w:abstractNumId="18" w15:restartNumberingAfterBreak="0">
     <w:nsid w:val="62DE18B3"/>
     <w:multiLevelType w:val="hybridMultilevel"/>
     <w:tmpl w:val="F9A86A04"/>
@@ -3942,7 +3553,7 @@
       </w:pPr>
     </w:lvl>
   </w:abstractNum>
-  <w:abstractNum w:abstractNumId="19">
+  <w:abstractNum w:abstractNumId="19" w15:restartNumberingAfterBreak="0">
     <w:nsid w:val="68E14DA4"/>
     <w:multiLevelType w:val="hybridMultilevel"/>
     <w:tmpl w:val="BA5ABAAA"/>
@@ -4031,7 +3642,7 @@
       </w:pPr>
     </w:lvl>
   </w:abstractNum>
-  <w:abstractNum w:abstractNumId="20">
+  <w:abstractNum w:abstractNumId="20" w15:restartNumberingAfterBreak="0">
     <w:nsid w:val="6CB34CF5"/>
     <w:multiLevelType w:val="hybridMultilevel"/>
     <w:tmpl w:val="19621FA2"/>
@@ -4120,7 +3731,7 @@
       </w:pPr>
     </w:lvl>
   </w:abstractNum>
-  <w:abstractNum w:abstractNumId="21">
+  <w:abstractNum w:abstractNumId="21" w15:restartNumberingAfterBreak="0">
     <w:nsid w:val="73E60DBD"/>
     <w:multiLevelType w:val="hybridMultilevel"/>
     <w:tmpl w:val="E2961934"/>
@@ -4209,7 +3820,7 @@
       </w:pPr>
     </w:lvl>
   </w:abstractNum>
-  <w:abstractNum w:abstractNumId="22">
+  <w:abstractNum w:abstractNumId="22" w15:restartNumberingAfterBreak="0">
     <w:nsid w:val="75046716"/>
     <w:multiLevelType w:val="hybridMultilevel"/>
     <w:tmpl w:val="12CECA32"/>
@@ -4298,7 +3909,7 @@
       </w:pPr>
     </w:lvl>
   </w:abstractNum>
-  <w:abstractNum w:abstractNumId="23">
+  <w:abstractNum w:abstractNumId="23" w15:restartNumberingAfterBreak="0">
     <w:nsid w:val="759D46B5"/>
     <w:multiLevelType w:val="hybridMultilevel"/>
     <w:tmpl w:val="88CEB804"/>
@@ -4411,7 +4022,7 @@
       </w:rPr>
     </w:lvl>
   </w:abstractNum>
-  <w:abstractNum w:abstractNumId="24">
+  <w:abstractNum w:abstractNumId="24" w15:restartNumberingAfterBreak="0">
     <w:nsid w:val="7E0548B9"/>
     <w:multiLevelType w:val="hybridMultilevel"/>
     <w:tmpl w:val="2E364302"/>
@@ -4500,86 +4111,86 @@
       </w:pPr>
     </w:lvl>
   </w:abstractNum>
-  <w:num w:numId="1">
+  <w:num w:numId="1" w16cid:durableId="2050644324">
     <w:abstractNumId w:val="8"/>
   </w:num>
-  <w:num w:numId="2">
+  <w:num w:numId="2" w16cid:durableId="1593122872">
     <w:abstractNumId w:val="1"/>
   </w:num>
-  <w:num w:numId="3">
+  <w:num w:numId="3" w16cid:durableId="53896884">
     <w:abstractNumId w:val="4"/>
   </w:num>
-  <w:num w:numId="4">
+  <w:num w:numId="4" w16cid:durableId="960381293">
     <w:abstractNumId w:val="19"/>
   </w:num>
-  <w:num w:numId="5">
+  <w:num w:numId="5" w16cid:durableId="629365915">
     <w:abstractNumId w:val="6"/>
   </w:num>
-  <w:num w:numId="6">
+  <w:num w:numId="6" w16cid:durableId="1652903328">
     <w:abstractNumId w:val="17"/>
   </w:num>
-  <w:num w:numId="7">
+  <w:num w:numId="7" w16cid:durableId="1296369146">
     <w:abstractNumId w:val="16"/>
   </w:num>
-  <w:num w:numId="8">
+  <w:num w:numId="8" w16cid:durableId="1439444957">
     <w:abstractNumId w:val="22"/>
   </w:num>
-  <w:num w:numId="9">
+  <w:num w:numId="9" w16cid:durableId="310331371">
     <w:abstractNumId w:val="24"/>
   </w:num>
-  <w:num w:numId="10">
+  <w:num w:numId="10" w16cid:durableId="1168710414">
     <w:abstractNumId w:val="7"/>
   </w:num>
-  <w:num w:numId="11">
+  <w:num w:numId="11" w16cid:durableId="619839944">
     <w:abstractNumId w:val="14"/>
   </w:num>
-  <w:num w:numId="12">
+  <w:num w:numId="12" w16cid:durableId="1507666789">
     <w:abstractNumId w:val="10"/>
   </w:num>
-  <w:num w:numId="13">
+  <w:num w:numId="13" w16cid:durableId="737285375">
     <w:abstractNumId w:val="21"/>
   </w:num>
-  <w:num w:numId="14">
+  <w:num w:numId="14" w16cid:durableId="351877684">
     <w:abstractNumId w:val="12"/>
   </w:num>
-  <w:num w:numId="15">
+  <w:num w:numId="15" w16cid:durableId="121193547">
     <w:abstractNumId w:val="9"/>
   </w:num>
-  <w:num w:numId="16">
+  <w:num w:numId="16" w16cid:durableId="1783720277">
     <w:abstractNumId w:val="18"/>
   </w:num>
-  <w:num w:numId="17">
+  <w:num w:numId="17" w16cid:durableId="576943602">
     <w:abstractNumId w:val="15"/>
   </w:num>
-  <w:num w:numId="18">
+  <w:num w:numId="18" w16cid:durableId="1233126635">
     <w:abstractNumId w:val="0"/>
   </w:num>
-  <w:num w:numId="19">
+  <w:num w:numId="19" w16cid:durableId="924649795">
     <w:abstractNumId w:val="2"/>
   </w:num>
-  <w:num w:numId="20">
+  <w:num w:numId="20" w16cid:durableId="1316186068">
     <w:abstractNumId w:val="5"/>
   </w:num>
-  <w:num w:numId="21">
+  <w:num w:numId="21" w16cid:durableId="1963531170">
     <w:abstractNumId w:val="3"/>
   </w:num>
-  <w:num w:numId="22">
+  <w:num w:numId="22" w16cid:durableId="786201946">
     <w:abstractNumId w:val="23"/>
   </w:num>
-  <w:num w:numId="23">
+  <w:num w:numId="23" w16cid:durableId="1336037715">
     <w:abstractNumId w:val="13"/>
   </w:num>
-  <w:num w:numId="24">
+  <w:num w:numId="24" w16cid:durableId="80108878">
     <w:abstractNumId w:val="20"/>
   </w:num>
-  <w:num w:numId="25">
+  <w:num w:numId="25" w16cid:durableId="1408310274">
     <w:abstractNumId w:val="11"/>
   </w:num>
 </w:numbering>
 </file>
 
 <file path=word/styles.xml><?xml version="1.0" encoding="utf-8"?>
-<w:styles xmlns:mc="http://schemas.openxmlformats.org/markup-compatibility/2006" xmlns:r="http://schemas.openxmlformats.org/officeDocument/2006/relationships" xmlns:w="http://schemas.openxmlformats.org/wordprocessingml/2006/main" xmlns:w14="http://schemas.microsoft.com/office/word/2010/wordml" xmlns:w15="http://schemas.microsoft.com/office/word/2012/wordml" mc:Ignorable="w14 w15">
+<w:styles xmlns:mc="http://schemas.openxmlformats.org/markup-compatibility/2006" xmlns:r="http://schemas.openxmlformats.org/officeDocument/2006/relationships" xmlns:w="http://schemas.openxmlformats.org/wordprocessingml/2006/main" xmlns:w14="http://schemas.microsoft.com/office/word/2010/wordml" xmlns:w15="http://schemas.microsoft.com/office/word/2012/wordml" xmlns:w16cex="http://schemas.microsoft.com/office/word/2018/wordml/cex" xmlns:w16cid="http://schemas.microsoft.com/office/word/2016/wordml/cid" xmlns:w16="http://schemas.microsoft.com/office/word/2018/wordml" xmlns:w16du="http://schemas.microsoft.com/office/word/2023/wordml/word16du" xmlns:w16sdtdh="http://schemas.microsoft.com/office/word/2020/wordml/sdtdatahash" xmlns:w16sdtfl="http://schemas.microsoft.com/office/word/2024/wordml/sdtformatlock" xmlns:w16se="http://schemas.microsoft.com/office/word/2015/wordml/symex" mc:Ignorable="w14 w15 w16se w16cid w16 w16cex w16sdtdh w16sdtfl w16du">
   <w:docDefaults>
     <w:rPrDefault>
       <w:rPr>
@@ -4597,7 +4208,7 @@
       </w:pPr>
     </w:pPrDefault>
   </w:docDefaults>
-  <w:latentStyles w:defLockedState="0" w:defUIPriority="99" w:defSemiHidden="0" w:defUnhideWhenUsed="0" w:defQFormat="0" w:count="371">
+  <w:latentStyles w:defLockedState="0" w:defUIPriority="99" w:defSemiHidden="0" w:defUnhideWhenUsed="0" w:defQFormat="0" w:count="376">
     <w:lsdException w:name="Normal" w:uiPriority="0" w:qFormat="1"/>
     <w:lsdException w:name="heading 1" w:uiPriority="9" w:qFormat="1"/>
     <w:lsdException w:name="heading 2" w:semiHidden="1" w:uiPriority="9" w:unhideWhenUsed="1" w:qFormat="1"/>
@@ -4969,6 +4580,11 @@
     <w:lsdException w:name="List Table 5 Dark Accent 6" w:uiPriority="50"/>
     <w:lsdException w:name="List Table 6 Colorful Accent 6" w:uiPriority="51"/>
     <w:lsdException w:name="List Table 7 Colorful Accent 6" w:uiPriority="52"/>
+    <w:lsdException w:name="Mention" w:semiHidden="1" w:unhideWhenUsed="1"/>
+    <w:lsdException w:name="Smart Hyperlink" w:semiHidden="1" w:unhideWhenUsed="1"/>
+    <w:lsdException w:name="Hashtag" w:semiHidden="1" w:unhideWhenUsed="1"/>
+    <w:lsdException w:name="Unresolved Mention" w:semiHidden="1" w:unhideWhenUsed="1"/>
+    <w:lsdException w:name="Smart Link" w:semiHidden="1" w:unhideWhenUsed="1"/>
   </w:latentStyles>
   <w:style w:type="paragraph" w:default="1" w:styleId="Normal">
     <w:name w:val="Normal"/>
@@ -5178,7 +4794,6 @@
       <w:rFonts w:eastAsiaTheme="minorEastAsia"/>
     </w:rPr>
     <w:tblPr>
-      <w:tblInd w:w="0" w:type="dxa"/>
       <w:tblBorders>
         <w:top w:val="single" w:sz="4" w:space="0" w:color="auto"/>
         <w:left w:val="single" w:sz="4" w:space="0" w:color="auto"/>
@@ -5187,12 +4802,6 @@
         <w:insideH w:val="single" w:sz="4" w:space="0" w:color="auto"/>
         <w:insideV w:val="single" w:sz="4" w:space="0" w:color="auto"/>
       </w:tblBorders>
-      <w:tblCellMar>
-        <w:top w:w="0" w:type="dxa"/>
-        <w:left w:w="108" w:type="dxa"/>
-        <w:bottom w:w="0" w:type="dxa"/>
-        <w:right w:w="108" w:type="dxa"/>
-      </w:tblCellMar>
     </w:tblPr>
   </w:style>
   <w:style w:type="character" w:customStyle="1" w:styleId="ListParagraphChar">

</xml_diff>